<commit_message>
Correct vacancy deadline to 2026
</commit_message>
<xml_diff>
--- a/public/documents/vacancies/konkurs-naukovo-pedagogichnyh-pracivnykiv-2025-2026.docx
+++ b/public/documents/vacancies/konkurs-naukovo-pedagogichnyh-pracivnykiv-2025-2026.docx
@@ -3132,7 +3132,7 @@
           <w:sz w:val="24"/>
           <w:szCs w:val="24"/>
         </w:rPr>
-        <w:t>до 24.08.2025 (включно)</w:t>
+        <w:t>до 24.08.2026 (включно)</w:t>
       </w:r>
     </w:p>
     <w:bookmarkEnd w:id="5"/>
@@ -3220,6 +3220,8 @@
       </w:pPr>
     </w:p>
     <w:sectPr>
+      <w:headerReference w:type="default" r:id="rId9"/>
+      <w:footerReference w:type="default" r:id="rId10"/>
       <w:pgSz w:w="11906" w:h="16838"/>
       <w:pgMar w:top="1134" w:right="567" w:bottom="851" w:left="1701" w:header="709" w:footer="709" w:gutter="0"/>
       <w:cols w:space="708"/>
@@ -3254,6 +3256,16 @@
 </w:endnotes>
 </file>
 
+<file path=word/footer1.xml><?xml version="1.0" encoding="utf-8"?>
+<w:ftr xmlns:m="http://schemas.openxmlformats.org/officeDocument/2006/math" xmlns:mc="http://schemas.openxmlformats.org/markup-compatibility/2006" xmlns:mo="http://schemas.microsoft.com/office/mac/office/2008/main" xmlns:mv="urn:schemas-microsoft-com:mac:vml" xmlns:o="urn:schemas-microsoft-com:office:office" xmlns:r="http://schemas.openxmlformats.org/officeDocument/2006/relationships" xmlns:v="urn:schemas-microsoft-com:vml" xmlns:w10="urn:schemas-microsoft-com:office:word" xmlns:w14="http://schemas.microsoft.com/office/word/2010/wordml" xmlns:w="http://schemas.openxmlformats.org/wordprocessingml/2006/main" xmlns:wne="http://schemas.microsoft.com/office/word/2006/wordml" xmlns:wp14="http://schemas.microsoft.com/office/word/2010/wordprocessingDrawing" xmlns:wp="http://schemas.openxmlformats.org/drawingml/2006/wordprocessingDrawing" xmlns:wpc="http://schemas.microsoft.com/office/word/2010/wordprocessingCanvas" xmlns:wpg="http://schemas.microsoft.com/office/word/2010/wordprocessingGroup" xmlns:wpi="http://schemas.microsoft.com/office/word/2010/wordprocessingInk" xmlns:wps="http://schemas.microsoft.com/office/word/2010/wordprocessingShape" mc:Ignorable="w14 wp14">
+  <w:p>
+    <w:pPr>
+      <w:pStyle w:val="Footer"/>
+    </w:pPr>
+  </w:p>
+</w:ftr>
+</file>
+
 <file path=word/footnotes.xml><?xml version="1.0" encoding="utf-8"?>
 <w:footnotes xmlns:wpc="http://schemas.microsoft.com/office/word/2010/wordprocessingCanvas" xmlns:cx="http://schemas.microsoft.com/office/drawing/2014/chartex" xmlns:cx1="http://schemas.microsoft.com/office/drawing/2015/9/8/chartex" xmlns:mc="http://schemas.openxmlformats.org/markup-compatibility/2006" xmlns:o="urn:schemas-microsoft-com:office:office" xmlns:r="http://schemas.openxmlformats.org/officeDocument/2006/relationships" xmlns:m="http://schemas.openxmlformats.org/officeDocument/2006/math" xmlns:v="urn:schemas-microsoft-com:vml" xmlns:wp14="http://schemas.microsoft.com/office/word/2010/wordprocessingDrawing" xmlns:wp="http://schemas.openxmlformats.org/drawingml/2006/wordprocessingDrawing" xmlns:w10="urn:schemas-microsoft-com:office:word" xmlns:w="http://schemas.openxmlformats.org/wordprocessingml/2006/main" xmlns:w14="http://schemas.microsoft.com/office/word/2010/wordml" xmlns:w15="http://schemas.microsoft.com/office/word/2012/wordml" xmlns:w16se="http://schemas.microsoft.com/office/word/2015/wordml/symex" xmlns:wpg="http://schemas.microsoft.com/office/word/2010/wordprocessingGroup" xmlns:wpi="http://schemas.microsoft.com/office/word/2010/wordprocessingInk" xmlns:wne="http://schemas.microsoft.com/office/word/2006/wordml" xmlns:wps="http://schemas.microsoft.com/office/word/2010/wordprocessingShape" mc:Ignorable="w14 w15 w16se wp14">
   <w:footnote w:type="separator" w:id="-1">
@@ -3277,6 +3289,16 @@
     </w:p>
   </w:footnote>
 </w:footnotes>
+</file>
+
+<file path=word/header1.xml><?xml version="1.0" encoding="utf-8"?>
+<w:hdr xmlns:m="http://schemas.openxmlformats.org/officeDocument/2006/math" xmlns:mc="http://schemas.openxmlformats.org/markup-compatibility/2006" xmlns:mo="http://schemas.microsoft.com/office/mac/office/2008/main" xmlns:mv="urn:schemas-microsoft-com:mac:vml" xmlns:o="urn:schemas-microsoft-com:office:office" xmlns:r="http://schemas.openxmlformats.org/officeDocument/2006/relationships" xmlns:v="urn:schemas-microsoft-com:vml" xmlns:w10="urn:schemas-microsoft-com:office:word" xmlns:w14="http://schemas.microsoft.com/office/word/2010/wordml" xmlns:w="http://schemas.openxmlformats.org/wordprocessingml/2006/main" xmlns:wne="http://schemas.microsoft.com/office/word/2006/wordml" xmlns:wp14="http://schemas.microsoft.com/office/word/2010/wordprocessingDrawing" xmlns:wp="http://schemas.openxmlformats.org/drawingml/2006/wordprocessingDrawing" xmlns:wpc="http://schemas.microsoft.com/office/word/2010/wordprocessingCanvas" xmlns:wpg="http://schemas.microsoft.com/office/word/2010/wordprocessingGroup" xmlns:wpi="http://schemas.microsoft.com/office/word/2010/wordprocessingInk" xmlns:wps="http://schemas.microsoft.com/office/word/2010/wordprocessingShape" mc:Ignorable="w14 wp14">
+  <w:p>
+    <w:pPr>
+      <w:pStyle w:val="Header"/>
+    </w:pPr>
+  </w:p>
+</w:hdr>
 </file>
 
 <file path=word/numbering.xml><?xml version="1.0" encoding="utf-8"?>

</xml_diff>